<commit_message>
docs(mikrotik): add WinBox/WebFig GUI click-path walkthrough
Mirror Steps 1-8 of the setup guide with a GUI equivalent so users can
follow either the CLI or the click path. Include sample report-12 export.
</commit_message>
<xml_diff>
--- a/mikrotik-dev-setup.docx
+++ b/mikrotik-dev-setup.docx
@@ -260,6 +260,569 @@
       </w:pPr>
       <w:r>
         <w:t>WinBox (easiest) — download from https://mikrotik.com/download (Windows). You can also use WebFig (browser) or SSH / the terminal — every step shows the CLI command, which works the same in WinBox's New Terminal, WebFig's Terminal, or SSH.</w:t>
+      </w:r>
+    </w:p>
+    <w:p>
+      <w:r>
+        <w:rPr>
+          <w:b w:val="0"/>
+          <w:i/>
+        </w:rPr>
+        <w:t>Prefer clicking to typing? The next section is the GUI equivalent of every step — do either the click-path or the CLI, not both.</w:t>
+      </w:r>
+    </w:p>
+    <w:p>
+      <w:pPr>
+        <w:pStyle w:val="Heading1"/>
+      </w:pPr>
+      <w:r>
+        <w:rPr>
+          <w:b w:val="0"/>
+          <w:i w:val="0"/>
+        </w:rPr>
+        <w:t>WinBox / WebFig walkthrough (the GUI / click path)</w:t>
+      </w:r>
+    </w:p>
+    <w:p>
+      <w:r>
+        <w:rPr>
+          <w:b w:val="0"/>
+          <w:i/>
+        </w:rPr>
+        <w:t>WinBox (desktop app) and WebFig (just browse to the router's IP, e.g. http://192.168.88.1) share the same left-hand menu tree, so every click path here works in both. WebFig also has a Terminal link if you'd rather paste the CLI from the steps below. This mirrors Steps 1–8 — pick one path.</w:t>
+      </w:r>
+    </w:p>
+    <w:p>
+      <w:r>
+        <w:rPr>
+          <w:b/>
+        </w:rPr>
+        <w:t xml:space="preserve">Connect — WinBox: </w:t>
+      </w:r>
+      <w:r>
+        <w:rPr>
+          <w:i w:val="0"/>
+        </w:rPr>
+        <w:t>open WinBox → Neighbors tab → it lists the router → click its MAC address (works even when the IP is unknown) → user admin, password blank → Connect. Newer units may force you to set an admin password on first login, and may pop a "RouterOS Default Configuration" notice (click OK to keep it). That admin password is not the monitoring account — we make a separate read-only user in Step 4.</w:t>
+      </w:r>
+    </w:p>
+    <w:p>
+      <w:r>
+        <w:rPr>
+          <w:b/>
+        </w:rPr>
+        <w:t xml:space="preserve">Connect — WebFig: </w:t>
+      </w:r>
+      <w:r>
+        <w:rPr>
+          <w:i w:val="0"/>
+        </w:rPr>
+        <w:t>browse to http://192.168.88.1 → log in as admin. You land on WebFig with the same menus as below. (If asked to upgrade RouterOS, skip it for a dev box.)</w:t>
+      </w:r>
+    </w:p>
+    <w:tbl>
+      <w:tblPr>
+        <w:tblStyle w:val="TableGrid"/>
+        <w:tblW w:type="auto" w:w="0"/>
+        <w:tblLook w:firstColumn="1" w:firstRow="1" w:lastColumn="0" w:lastRow="0" w:noHBand="0" w:noVBand="1" w:val="04A0"/>
+      </w:tblPr>
+      <w:tblGrid>
+        <w:gridCol w:w="2160"/>
+        <w:gridCol w:w="2160"/>
+        <w:gridCol w:w="2160"/>
+        <w:gridCol w:w="2160"/>
+      </w:tblGrid>
+      <w:tr>
+        <w:tc>
+          <w:tcPr>
+            <w:tcW w:type="dxa" w:w="2160"/>
+          </w:tcPr>
+          <w:p>
+            <w:r>
+              <w:rPr>
+                <w:b/>
+              </w:rPr>
+              <w:t>Step</w:t>
+            </w:r>
+          </w:p>
+        </w:tc>
+        <w:tc>
+          <w:tcPr>
+            <w:tcW w:type="dxa" w:w="2160"/>
+          </w:tcPr>
+          <w:p>
+            <w:r>
+              <w:rPr>
+                <w:b/>
+              </w:rPr>
+              <w:t>Goal</w:t>
+            </w:r>
+          </w:p>
+        </w:tc>
+        <w:tc>
+          <w:tcPr>
+            <w:tcW w:type="dxa" w:w="2160"/>
+          </w:tcPr>
+          <w:p>
+            <w:r>
+              <w:rPr>
+                <w:b/>
+              </w:rPr>
+              <w:t>Click path (WinBox / WebFig)</w:t>
+            </w:r>
+          </w:p>
+        </w:tc>
+        <w:tc>
+          <w:tcPr>
+            <w:tcW w:type="dxa" w:w="2160"/>
+          </w:tcPr>
+          <w:p>
+            <w:r>
+              <w:rPr>
+                <w:b/>
+              </w:rPr>
+              <w:t>What to do</w:t>
+            </w:r>
+          </w:p>
+        </w:tc>
+      </w:tr>
+      <w:tr>
+        <w:tc>
+          <w:tcPr>
+            <w:tcW w:type="dxa" w:w="2160"/>
+          </w:tcPr>
+          <w:p>
+            <w:r>
+              <w:t>2</w:t>
+            </w:r>
+          </w:p>
+        </w:tc>
+        <w:tc>
+          <w:tcPr>
+            <w:tcW w:type="dxa" w:w="2160"/>
+          </w:tcPr>
+          <w:p>
+            <w:r>
+              <w:t>Version &amp; identity</w:t>
+            </w:r>
+          </w:p>
+        </w:tc>
+        <w:tc>
+          <w:tcPr>
+            <w:tcW w:type="dxa" w:w="2160"/>
+          </w:tcPr>
+          <w:p>
+            <w:r>
+              <w:t>System → Resources</w:t>
+            </w:r>
+          </w:p>
+        </w:tc>
+        <w:tc>
+          <w:tcPr>
+            <w:tcW w:type="dxa" w:w="2160"/>
+          </w:tcPr>
+          <w:p>
+            <w:r>
+              <w:t>Read Version (v6/v7), Board Name, CPU, Memory, Uptime</w:t>
+            </w:r>
+          </w:p>
+        </w:tc>
+      </w:tr>
+      <w:tr>
+        <w:tc>
+          <w:tcPr>
+            <w:tcW w:type="dxa" w:w="2160"/>
+          </w:tcPr>
+          <w:p>
+            <w:r>
+              <w:t>2</w:t>
+            </w:r>
+          </w:p>
+        </w:tc>
+        <w:tc>
+          <w:tcPr>
+            <w:tcW w:type="dxa" w:w="2160"/>
+          </w:tcPr>
+          <w:p>
+            <w:r>
+              <w:t>Name the router</w:t>
+            </w:r>
+          </w:p>
+        </w:tc>
+        <w:tc>
+          <w:tcPr>
+            <w:tcW w:type="dxa" w:w="2160"/>
+          </w:tcPr>
+          <w:p>
+            <w:r>
+              <w:t>System → Identity</w:t>
+            </w:r>
+          </w:p>
+        </w:tc>
+        <w:tc>
+          <w:tcPr>
+            <w:tcW w:type="dxa" w:w="2160"/>
+          </w:tcPr>
+          <w:p>
+            <w:r>
+              <w:t>Set Name = dev-mikrotik → OK/Apply</w:t>
+            </w:r>
+          </w:p>
+        </w:tc>
+      </w:tr>
+      <w:tr>
+        <w:tc>
+          <w:tcPr>
+            <w:tcW w:type="dxa" w:w="2160"/>
+          </w:tcPr>
+          <w:p>
+            <w:r>
+              <w:t>2</w:t>
+            </w:r>
+          </w:p>
+        </w:tc>
+        <w:tc>
+          <w:tcPr>
+            <w:tcW w:type="dxa" w:w="2160"/>
+          </w:tcPr>
+          <w:p>
+            <w:r>
+              <w:t>See its IP</w:t>
+            </w:r>
+          </w:p>
+        </w:tc>
+        <w:tc>
+          <w:tcPr>
+            <w:tcW w:type="dxa" w:w="2160"/>
+          </w:tcPr>
+          <w:p>
+            <w:r>
+              <w:t>IP → Addresses</w:t>
+            </w:r>
+          </w:p>
+        </w:tc>
+        <w:tc>
+          <w:tcPr>
+            <w:tcW w:type="dxa" w:w="2160"/>
+          </w:tcPr>
+          <w:p>
+            <w:r>
+              <w:t>Note the address (e.g. 192.168.88.1)</w:t>
+            </w:r>
+          </w:p>
+        </w:tc>
+      </w:tr>
+      <w:tr>
+        <w:tc>
+          <w:tcPr>
+            <w:tcW w:type="dxa" w:w="2160"/>
+          </w:tcPr>
+          <w:p>
+            <w:r>
+              <w:t>3</w:t>
+            </w:r>
+          </w:p>
+        </w:tc>
+        <w:tc>
+          <w:tcPr>
+            <w:tcW w:type="dxa" w:w="2160"/>
+          </w:tcPr>
+          <w:p>
+            <w:r>
+              <w:t>Enable the API</w:t>
+            </w:r>
+          </w:p>
+        </w:tc>
+        <w:tc>
+          <w:tcPr>
+            <w:tcW w:type="dxa" w:w="2160"/>
+          </w:tcPr>
+          <w:p>
+            <w:r>
+              <w:t>IP → Services</w:t>
+            </w:r>
+          </w:p>
+        </w:tc>
+        <w:tc>
+          <w:tcPr>
+            <w:tcW w:type="dxa" w:w="2160"/>
+          </w:tcPr>
+          <w:p>
+            <w:r>
+              <w:t>Select the api row → click the ✓ (Enable) toolbar button. Double-click api to confirm Port = 8728</w:t>
+            </w:r>
+          </w:p>
+        </w:tc>
+      </w:tr>
+      <w:tr>
+        <w:tc>
+          <w:tcPr>
+            <w:tcW w:type="dxa" w:w="2160"/>
+          </w:tcPr>
+          <w:p>
+            <w:r>
+              <w:t>4</w:t>
+            </w:r>
+          </w:p>
+        </w:tc>
+        <w:tc>
+          <w:tcPr>
+            <w:tcW w:type="dxa" w:w="2160"/>
+          </w:tcPr>
+          <w:p>
+            <w:r>
+              <w:t>Read-only group</w:t>
+            </w:r>
+          </w:p>
+        </w:tc>
+        <w:tc>
+          <w:tcPr>
+            <w:tcW w:type="dxa" w:w="2160"/>
+          </w:tcPr>
+          <w:p>
+            <w:r>
+              <w:t>System → Users → Groups tab → +</w:t>
+            </w:r>
+          </w:p>
+        </w:tc>
+        <w:tc>
+          <w:tcPr>
+            <w:tcW w:type="dxa" w:w="2160"/>
+          </w:tcPr>
+          <w:p>
+            <w:r>
+              <w:t>Name monitoring; tick policies read, api, rest-api, test, winbox → OK</w:t>
+            </w:r>
+          </w:p>
+        </w:tc>
+      </w:tr>
+      <w:tr>
+        <w:tc>
+          <w:tcPr>
+            <w:tcW w:type="dxa" w:w="2160"/>
+          </w:tcPr>
+          <w:p>
+            <w:r>
+              <w:t>4</w:t>
+            </w:r>
+          </w:p>
+        </w:tc>
+        <w:tc>
+          <w:tcPr>
+            <w:tcW w:type="dxa" w:w="2160"/>
+          </w:tcPr>
+          <w:p>
+            <w:r>
+              <w:t>Read-only user</w:t>
+            </w:r>
+          </w:p>
+        </w:tc>
+        <w:tc>
+          <w:tcPr>
+            <w:tcW w:type="dxa" w:w="2160"/>
+          </w:tcPr>
+          <w:p>
+            <w:r>
+              <w:t>System → Users → Users tab → +</w:t>
+            </w:r>
+          </w:p>
+        </w:tc>
+        <w:tc>
+          <w:tcPr>
+            <w:tcW w:type="dxa" w:w="2160"/>
+          </w:tcPr>
+          <w:p>
+            <w:r>
+              <w:t>Name monitor-ro; Group = monitoring; set a strong Password → OK</w:t>
+            </w:r>
+          </w:p>
+        </w:tc>
+      </w:tr>
+      <w:tr>
+        <w:tc>
+          <w:tcPr>
+            <w:tcW w:type="dxa" w:w="2160"/>
+          </w:tcPr>
+          <w:p>
+            <w:r>
+              <w:t>5</w:t>
+            </w:r>
+          </w:p>
+        </w:tc>
+        <w:tc>
+          <w:tcPr>
+            <w:tcW w:type="dxa" w:w="2160"/>
+          </w:tcPr>
+          <w:p>
+            <w:r>
+              <w:t>Lock API to backend</w:t>
+            </w:r>
+          </w:p>
+        </w:tc>
+        <w:tc>
+          <w:tcPr>
+            <w:tcW w:type="dxa" w:w="2160"/>
+          </w:tcPr>
+          <w:p>
+            <w:r>
+              <w:t>IP → Services → double-click api</w:t>
+            </w:r>
+          </w:p>
+        </w:tc>
+        <w:tc>
+          <w:tcPr>
+            <w:tcW w:type="dxa" w:w="2160"/>
+          </w:tcPr>
+          <w:p>
+            <w:r>
+              <w:t>Available From → add 192.168.88.0/24 (or your backend host as /32) → OK</w:t>
+            </w:r>
+          </w:p>
+        </w:tc>
+      </w:tr>
+      <w:tr>
+        <w:tc>
+          <w:tcPr>
+            <w:tcW w:type="dxa" w:w="2160"/>
+          </w:tcPr>
+          <w:p>
+            <w:r>
+              <w:t>6</w:t>
+            </w:r>
+          </w:p>
+        </w:tc>
+        <w:tc>
+          <w:tcPr>
+            <w:tcW w:type="dxa" w:w="2160"/>
+          </w:tcPr>
+          <w:p>
+            <w:r>
+              <w:t>List interfaces</w:t>
+            </w:r>
+          </w:p>
+        </w:tc>
+        <w:tc>
+          <w:tcPr>
+            <w:tcW w:type="dxa" w:w="2160"/>
+          </w:tcPr>
+          <w:p>
+            <w:r>
+              <w:t>Interfaces</w:t>
+            </w:r>
+          </w:p>
+        </w:tc>
+        <w:tc>
+          <w:tcPr>
+            <w:tcW w:type="dxa" w:w="2160"/>
+          </w:tcPr>
+          <w:p>
+            <w:r>
+              <w:t>The ether1…etherN names = your test "buildings". Double-click one → Status tab shows link Rate &amp; state</w:t>
+            </w:r>
+          </w:p>
+        </w:tc>
+      </w:tr>
+      <w:tr>
+        <w:tc>
+          <w:tcPr>
+            <w:tcW w:type="dxa" w:w="2160"/>
+          </w:tcPr>
+          <w:p>
+            <w:r>
+              <w:t>6</w:t>
+            </w:r>
+          </w:p>
+        </w:tc>
+        <w:tc>
+          <w:tcPr>
+            <w:tcW w:type="dxa" w:w="2160"/>
+          </w:tcPr>
+          <w:p>
+            <w:r>
+              <w:t>Bridge check</w:t>
+            </w:r>
+          </w:p>
+        </w:tc>
+        <w:tc>
+          <w:tcPr>
+            <w:tcW w:type="dxa" w:w="2160"/>
+          </w:tcPr>
+          <w:p>
+            <w:r>
+              <w:t>Bridge → Ports tab</w:t>
+            </w:r>
+          </w:p>
+        </w:tc>
+        <w:tc>
+          <w:tcPr>
+            <w:tcW w:type="dxa" w:w="2160"/>
+          </w:tcPr>
+          <w:p>
+            <w:r>
+              <w:t>See which etherN sit in the factory bridge. Fine to leave for basic monitoring; per-building client counts need separate subnets/DHCP (see Optional below)</w:t>
+            </w:r>
+          </w:p>
+        </w:tc>
+      </w:tr>
+      <w:tr>
+        <w:tc>
+          <w:tcPr>
+            <w:tcW w:type="dxa" w:w="2160"/>
+          </w:tcPr>
+          <w:p>
+            <w:r>
+              <w:t>—</w:t>
+            </w:r>
+          </w:p>
+        </w:tc>
+        <w:tc>
+          <w:tcPr>
+            <w:tcW w:type="dxa" w:w="2160"/>
+          </w:tcPr>
+          <w:p>
+            <w:r>
+              <w:t>DHCP leases (clients)</w:t>
+            </w:r>
+          </w:p>
+        </w:tc>
+        <w:tc>
+          <w:tcPr>
+            <w:tcW w:type="dxa" w:w="2160"/>
+          </w:tcPr>
+          <w:p>
+            <w:r>
+              <w:t>IP → DHCP Server → Leases tab</w:t>
+            </w:r>
+          </w:p>
+        </w:tc>
+        <w:tc>
+          <w:tcPr>
+            <w:tcW w:type="dxa" w:w="2160"/>
+          </w:tcPr>
+          <w:p>
+            <w:r>
+              <w:t>Bound leases = the "connected clients" the poller counts</w:t>
+            </w:r>
+          </w:p>
+        </w:tc>
+      </w:tr>
+    </w:tbl>
+    <w:p>
+      <w:r>
+        <w:rPr>
+          <w:b w:val="0"/>
+          <w:i/>
+        </w:rPr>
+        <w:t>Step 7 (reachability) is not done in WinBox — run it from the backend PC (Test-NetConnection … 8728, Step 7 below). Step 8 is just writing down the values you read above for the DB seed + .env.</w:t>
+      </w:r>
+    </w:p>
+    <w:p>
+      <w:r>
+        <w:rPr>
+          <w:b w:val="0"/>
+          <w:i w:val="0"/>
+        </w:rPr>
+        <w:t>✅ Sanity check after Steps 3 &amp; 5: in IP → Services, the api row shows no X (disabled) flag, Port 8728, and your Available From address.</w:t>
       </w:r>
     </w:p>
     <w:p>

</xml_diff>